<commit_message>
Updated dataset guide and added project code resources
</commit_message>
<xml_diff>
--- a/Dataset_Resources/Dataset Resource Guide.docx
+++ b/Dataset_Resources/Dataset Resource Guide.docx
@@ -35,7 +35,23 @@
           <w:b/>
           <w:bCs/>
         </w:rPr>
-        <w:t>Symmetric Boundary-Enhanced Mamba-UNet for Glomerulus Segmentation in Kidney Histopathology Images</w:t>
+        <w:t>Symmetric Boundary-Enhanced Mamba-</w:t>
+      </w:r>
+      <w:proofErr w:type="spellStart"/>
+      <w:r>
+        <w:rPr>
+          <w:b/>
+          <w:bCs/>
+        </w:rPr>
+        <w:t>UNet</w:t>
+      </w:r>
+      <w:proofErr w:type="spellEnd"/>
+      <w:r>
+        <w:rPr>
+          <w:b/>
+          <w:bCs/>
+        </w:rPr>
+        <w:t xml:space="preserve"> for Glomerulus Segmentation in Kidney Histopathology Images</w:t>
       </w:r>
     </w:p>
     <w:p>
@@ -62,13 +78,60 @@
       <w:pPr>
         <w:pStyle w:val="Heading3"/>
       </w:pPr>
-      <w:r>
-        <w:t>HuBMAP - Hacking the Kidney Dataset</w:t>
-      </w:r>
-    </w:p>
-    <w:p>
-      <w:r>
-        <w:t>The HuBMAP dataset contains high-resolution digital pathology images of human kidney biopsy tissue. The dataset was created to support research in glomerulus segmentation and kidney disease analysis.</w:t>
+      <w:proofErr w:type="spellStart"/>
+      <w:r>
+        <w:t>HuBMAP</w:t>
+      </w:r>
+      <w:proofErr w:type="spellEnd"/>
+      <w:r>
+        <w:t xml:space="preserve"> - Hacking the Kidney Dataset</w:t>
+      </w:r>
+    </w:p>
+    <w:p>
+      <w:pPr>
+        <w:rPr>
+          <w:b/>
+          <w:bCs/>
+          <w:u w:val="single"/>
+        </w:rPr>
+      </w:pPr>
+      <w:r>
+        <w:rPr>
+          <w:b/>
+          <w:bCs/>
+          <w:u w:val="single"/>
+        </w:rPr>
+        <w:t>Link:</w:t>
+      </w:r>
+    </w:p>
+    <w:p>
+      <w:pPr>
+        <w:rPr>
+          <w:b/>
+          <w:bCs/>
+          <w:u w:val="single"/>
+        </w:rPr>
+      </w:pPr>
+      <w:r>
+        <w:rPr>
+          <w:b/>
+          <w:bCs/>
+          <w:u w:val="single"/>
+        </w:rPr>
+        <w:t>https://www.kaggle.com/competitions/hubmap-kidney-segmentation/data</w:t>
+      </w:r>
+    </w:p>
+    <w:p>
+      <w:r>
+        <w:t xml:space="preserve">The </w:t>
+      </w:r>
+      <w:proofErr w:type="spellStart"/>
+      <w:r>
+        <w:t>HuBMAP</w:t>
+      </w:r>
+      <w:proofErr w:type="spellEnd"/>
+      <w:r>
+        <w:t xml:space="preserve"> dataset contains high-resolution digital pathology images of human kidney biopsy tissue. The dataset was created to support research in glomerulus segmentation and kidney disease analysis.</w:t>
       </w:r>
     </w:p>
     <w:p>
@@ -133,6 +196,7 @@
         <w:pStyle w:val="Heading2"/>
       </w:pPr>
       <w:r>
+        <w:lastRenderedPageBreak/>
         <w:t>1. TIFF Files (Whole Slide Images)</w:t>
       </w:r>
     </w:p>
@@ -143,7 +207,6 @@
     </w:p>
     <w:p>
       <w:r>
-        <w:lastRenderedPageBreak/>
         <w:t>A kidney biopsy does not capture the entire kidney. Instead, a very small tissue sample is collected and placed on a microscope slide. This slide is then scanned using a pathology scanner to create a digital Whole Slide Image (WSI).</w:t>
       </w:r>
     </w:p>
@@ -295,12 +358,12 @@
     </w:p>
     <w:p>
       <w:r>
+        <w:lastRenderedPageBreak/>
         <w:t>Similarly, the JSON file tells us exactly where each glomerulus is located within the TIFF image.</w:t>
       </w:r>
     </w:p>
     <w:p>
       <w:r>
-        <w:lastRenderedPageBreak/>
         <w:pict w14:anchorId="0E75E6C3">
           <v:rect id="_x0000_i1029" style="width:0;height:1.5pt" o:hralign="center" o:hrstd="t" o:hr="t" fillcolor="#a0a0a0" stroked="f"/>
         </w:pict>
@@ -451,12 +514,12 @@
         </w:numPr>
       </w:pPr>
       <w:r>
+        <w:lastRenderedPageBreak/>
         <w:t>CSV → Contains metadata and references.</w:t>
       </w:r>
     </w:p>
     <w:p>
       <w:r>
-        <w:lastRenderedPageBreak/>
         <w:t>Individually these files provide partial information.</w:t>
       </w:r>
     </w:p>
@@ -598,17 +661,41 @@
     </w:p>
     <w:p>
       <w:r>
-        <w:t>The base research paper uses the HuBMAP dataset as the foundation for training and evaluating segmentation models.</w:t>
-      </w:r>
-    </w:p>
-    <w:p>
-      <w:r>
-        <w:t>The dataset provides the tissue images and annotation information required to create image-mask pairs, while the proposed Boundary-Enhanced Mamba-UNet architecture focuses on improving segmentation quality and boundary accuracy of glomeruli.</w:t>
-      </w:r>
-    </w:p>
-    <w:p>
-      <w:r>
-        <w:t>Thus, the dataset serves as the source of information, while the segmentation model serves as the learning system that interprets and analyzes that information.</w:t>
+        <w:t xml:space="preserve">The base research paper uses the </w:t>
+      </w:r>
+      <w:proofErr w:type="spellStart"/>
+      <w:r>
+        <w:t>HuBMAP</w:t>
+      </w:r>
+      <w:proofErr w:type="spellEnd"/>
+      <w:r>
+        <w:t xml:space="preserve"> dataset as the foundation for training and evaluating segmentation models.</w:t>
+      </w:r>
+    </w:p>
+    <w:p>
+      <w:r>
+        <w:t>The dataset provides the tissue images and annotation information required to create image-mask pairs, while the proposed Boundary-Enhanced Mamba-</w:t>
+      </w:r>
+      <w:proofErr w:type="spellStart"/>
+      <w:r>
+        <w:t>UNet</w:t>
+      </w:r>
+      <w:proofErr w:type="spellEnd"/>
+      <w:r>
+        <w:t xml:space="preserve"> architecture focuses on improving segmentation quality and boundary accuracy of glomeruli.</w:t>
+      </w:r>
+    </w:p>
+    <w:p>
+      <w:r>
+        <w:t xml:space="preserve">Thus, the dataset serves as the source of information, while the segmentation model serves as the learning system that interprets and </w:t>
+      </w:r>
+      <w:proofErr w:type="spellStart"/>
+      <w:r>
+        <w:t>analyzes</w:t>
+      </w:r>
+      <w:proofErr w:type="spellEnd"/>
+      <w:r>
+        <w:t xml:space="preserve"> that information.</w:t>
       </w:r>
     </w:p>
     <w:p>
@@ -670,7 +757,15 @@
         <w:t xml:space="preserve">FIGURE: </w:t>
       </w:r>
       <w:r>
-        <w:t>Example Image–Mask Pairs Generated from HuBMAP Whole Slide Images</w:t>
+        <w:t xml:space="preserve">Example Image–Mask Pairs Generated from </w:t>
+      </w:r>
+      <w:proofErr w:type="spellStart"/>
+      <w:r>
+        <w:t>HuBMAP</w:t>
+      </w:r>
+      <w:proofErr w:type="spellEnd"/>
+      <w:r>
+        <w:t xml:space="preserve"> Whole Slide Images</w:t>
       </w:r>
     </w:p>
     <w:p>
@@ -731,8 +826,13 @@
       <w:r>
         <w:t xml:space="preserve">FIGURE: </w:t>
       </w:r>
-      <w:r>
-        <w:t>UNet Validation Example Showing Original Image, Ground Truth Mask, Predicted Mask, and Overlay Visualization</w:t>
+      <w:proofErr w:type="spellStart"/>
+      <w:r>
+        <w:t>UNet</w:t>
+      </w:r>
+      <w:proofErr w:type="spellEnd"/>
+      <w:r>
+        <w:t xml:space="preserve"> Validation Example Showing Original Image, Ground Truth Mask, Predicted Mask, and Overlay Visualization</w:t>
       </w:r>
     </w:p>
     <w:sectPr>

</xml_diff>